<commit_message>
Ghi rõ mốc chuyển giao 00h00 ngày 01/11/2026 tại phần mở đầu, Mục II.1 và Mục III
Co-Authored-By: Claude Opus 5.5 <noreply@anthropic.com>
Claude-Session: https://claude.ai/code/session_0111U8Jqcck5scPA4qQYmL2d
</commit_message>
<xml_diff>
--- a/26.10.2026 PHU LUC SUA DOI 02 HD 140.2026 GAS D (huy.dt gop y).docx
+++ b/26.10.2026 PHU LUC SUA DOI 02 HD 140.2026 GAS D (huy.dt gop y).docx
@@ -2791,14 +2791,26 @@
         </w:rPr>
         <w:t xml:space="preserve">Chi nhánh Kinh doanh LNG -Tổng công ty Khí Việt Nam - CTCP</w:t>
       </w:r>
-      <w:r>
-        <w:rPr>
-          <w:rFonts w:ascii="Times New Roman" w:hAnsi="Times New Roman"/>
-          <w:sz w:val="26"/>
-          <w:szCs w:val="26"/>
-        </w:rPr>
-        <w:t xml:space="preserve"> với các nội dung như sau:</w:t>
-      </w:r>
+      <w:del w:id="9023" w:author="huy.dt" w:date="2026-10-27T08:00:00Z">
+        <w:r>
+          <w:rPr>
+            <w:rFonts w:ascii="Times New Roman" w:hAnsi="Times New Roman"/>
+            <w:sz w:val="26"/>
+            <w:szCs w:val="26"/>
+          </w:rPr>
+          <w:delText xml:space="preserve"> với các nội dung như sau:</w:delText>
+        </w:r>
+      </w:del>
+      <w:ins w:id="9024" w:author="huy.dt" w:date="2026-10-27T08:00:00Z">
+        <w:r>
+          <w:rPr>
+            <w:rFonts w:ascii="Times New Roman" w:hAnsi="Times New Roman"/>
+            <w:sz w:val="26"/>
+            <w:szCs w:val="26"/>
+          </w:rPr>
+          <w:t xml:space="preserve"> kể từ 00 giờ 00 phút ngày 01/11/2026 với các nội dung như sau:</w:t>
+        </w:r>
+      </w:ins>
     </w:p>
     <w:p>
       <w:pPr>
@@ -2970,7 +2982,7 @@
         </w:rPr>
         <w:t>"</w:t>
       </w:r>
-      <w:del w:id="9023" w:author="huy.dt" w:date="2026-10-27T08:00:00Z">
+      <w:del w:id="9025" w:author="huy.dt" w:date="2026-10-27T08:00:00Z">
         <w:r>
           <w:rPr>
             <w:color w:val="FF0000"/>
@@ -2979,7 +2991,7 @@
           <w:delText xml:space="preserve">: là 00h ngày … tháng…năm 2026</w:delText>
         </w:r>
       </w:del>
-      <w:ins w:id="9024" w:author="huy.dt" w:date="2026-10-27T08:00:00Z">
+      <w:ins w:id="9026" w:author="huy.dt" w:date="2026-10-27T08:00:00Z">
         <w:r>
           <w:rPr>
             <w:color w:val="FF0000"/>
@@ -3008,11 +3020,11 @@
         <w:spacing w:after="120" w:line="276" w:lineRule="auto"/>
         <w:ind w:left="0" w:firstLine="567"/>
         <w:rPr>
-          <w:ins w:id="9025" w:author="huy.dt" w:date="2026-10-27T08:00:00Z"/>
+          <w:ins w:id="9027" w:author="huy.dt" w:date="2026-10-27T08:00:00Z"/>
           <w:lang w:val="fr-FR"/>
         </w:rPr>
       </w:pPr>
-      <w:ins w:id="9026" w:author="huy.dt" w:date="2026-10-27T08:00:00Z">
+      <w:ins w:id="9028" w:author="huy.dt" w:date="2026-10-27T08:00:00Z">
         <w:r>
           <w:rPr>
             <w:b/>
@@ -3021,7 +3033,7 @@
           <w:t xml:space="preserve">"Thời điểm chốt số liệu"</w:t>
         </w:r>
       </w:ins>
-      <w:ins w:id="9027" w:author="huy.dt" w:date="2026-10-27T08:00:00Z">
+      <w:ins w:id="9029" w:author="huy.dt" w:date="2026-10-27T08:00:00Z">
         <w:r>
           <w:rPr>
             <w:lang w:val="fr-FR"/>
@@ -3042,11 +3054,11 @@
         <w:spacing w:after="120" w:line="276" w:lineRule="auto"/>
         <w:ind w:left="0" w:firstLine="567"/>
         <w:rPr>
-          <w:ins w:id="9028" w:author="huy.dt" w:date="2026-10-27T08:00:00Z"/>
+          <w:ins w:id="9030" w:author="huy.dt" w:date="2026-10-27T08:00:00Z"/>
           <w:lang w:val="fr-FR"/>
         </w:rPr>
       </w:pPr>
-      <w:ins w:id="9029" w:author="huy.dt" w:date="2026-10-27T08:00:00Z">
+      <w:ins w:id="9031" w:author="huy.dt" w:date="2026-10-27T08:00:00Z">
         <w:r>
           <w:rPr>
             <w:b/>
@@ -3055,7 +3067,7 @@
           <w:t xml:space="preserve">"Chuyến HÀNG trước chuyển giao"</w:t>
         </w:r>
       </w:ins>
-      <w:ins w:id="9030" w:author="huy.dt" w:date="2026-10-27T08:00:00Z">
+      <w:ins w:id="9032" w:author="huy.dt" w:date="2026-10-27T08:00:00Z">
         <w:r>
           <w:rPr>
             <w:lang w:val="fr-FR"/>
@@ -3076,11 +3088,11 @@
         <w:spacing w:after="120" w:line="276" w:lineRule="auto"/>
         <w:ind w:left="0" w:firstLine="567"/>
         <w:rPr>
-          <w:ins w:id="9031" w:author="huy.dt" w:date="2026-10-27T08:00:00Z"/>
+          <w:ins w:id="9033" w:author="huy.dt" w:date="2026-10-27T08:00:00Z"/>
           <w:lang w:val="fr-FR"/>
         </w:rPr>
       </w:pPr>
-      <w:ins w:id="9032" w:author="huy.dt" w:date="2026-10-27T08:00:00Z">
+      <w:ins w:id="9034" w:author="huy.dt" w:date="2026-10-27T08:00:00Z">
         <w:r>
           <w:rPr>
             <w:b/>
@@ -3089,7 +3101,7 @@
           <w:t xml:space="preserve">"Nghĩa vụ trước chuyển giao"</w:t>
         </w:r>
       </w:ins>
-      <w:ins w:id="9033" w:author="huy.dt" w:date="2026-10-27T08:00:00Z">
+      <w:ins w:id="9035" w:author="huy.dt" w:date="2026-10-27T08:00:00Z">
         <w:r>
           <w:rPr>
             <w:lang w:val="fr-FR"/>
@@ -3151,7 +3163,7 @@
         </w:rPr>
         <w:t xml:space="preserve">Bên A đồng ý chuyển giao và Bên C đồng ý nhận </w:t>
       </w:r>
-      <w:del w:id="9034" w:author="huy.dt" w:date="2026-10-27T08:00:00Z">
+      <w:del w:id="9036" w:author="huy.dt" w:date="2026-10-27T08:00:00Z">
         <w:r>
           <w:rPr>
             <w:bCs/>
@@ -3160,7 +3172,7 @@
           <w:delText xml:space="preserve">toàn bộ việc thực hiện các quyền</w:delText>
         </w:r>
       </w:del>
-      <w:ins w:id="9035" w:author="huy.dt" w:date="2026-10-27T08:00:00Z">
+      <w:ins w:id="9037" w:author="huy.dt" w:date="2026-10-27T08:00:00Z">
         <w:r>
           <w:rPr>
             <w:bCs/>
@@ -3174,9 +3186,27 @@
           <w:bCs/>
           <w:lang w:val="pt-BR"/>
         </w:rPr>
-        <w:t xml:space="preserve">, nghĩa vụ và trách nhiệm của Bên A trong Hợp đồng đối với Bên B và được Bên B chấp thuận kể từ Ngày chuyển giao. </w:t>
-      </w:r>
-      <w:ins w:id="9036" w:author="huy.dt" w:date="2026-10-27T08:00:00Z">
+        <w:t xml:space="preserve">, nghĩa vụ và trách nhiệm của Bên A trong Hợp đồng đối với Bên B và được Bên B chấp thuận </w:t>
+      </w:r>
+      <w:del w:id="9038" w:author="huy.dt" w:date="2026-10-27T08:00:00Z">
+        <w:r>
+          <w:rPr>
+            <w:bCs/>
+            <w:lang w:val="pt-BR"/>
+          </w:rPr>
+          <w:delText xml:space="preserve">kể từ Ngày chuyển giao. </w:delText>
+        </w:r>
+      </w:del>
+      <w:ins w:id="9039" w:author="huy.dt" w:date="2026-10-27T08:00:00Z">
+        <w:r>
+          <w:rPr>
+            <w:bCs/>
+            <w:lang w:val="pt-BR"/>
+          </w:rPr>
+          <w:t xml:space="preserve">kể từ Ngày chuyển giao (00 giờ 00 phút ngày 01/11/2026). </w:t>
+        </w:r>
+      </w:ins>
+      <w:ins w:id="9040" w:author="huy.dt" w:date="2026-10-27T08:00:00Z">
         <w:r>
           <w:rPr>
             <w:bCs/>
@@ -3218,7 +3248,7 @@
         </w:rPr>
         <w:t xml:space="preserve">Các cụm từ “Bên Bán” trong Hợp đồng sau Ngày chuyển giao sẽ được hiểu là Bên C.</w:t>
       </w:r>
-      <w:ins w:id="9037" w:author="huy.dt" w:date="2026-10-27T08:00:00Z">
+      <w:ins w:id="9041" w:author="huy.dt" w:date="2026-10-27T08:00:00Z">
         <w:r>
           <w:rPr>
             <w:bCs/>
@@ -3252,7 +3282,7 @@
         </w:rPr>
         <w:t xml:space="preserve">Xác nhận công nợ và khối lượng </w:t>
       </w:r>
-      <w:del w:id="9038" w:author="huy.dt" w:date="2026-10-27T08:00:00Z">
+      <w:del w:id="9042" w:author="huy.dt" w:date="2026-10-27T08:00:00Z">
         <w:r>
           <w:rPr>
             <w:lang w:val="pt-BR"/>
@@ -3260,7 +3290,7 @@
           <w:delText xml:space="preserve">khí</w:delText>
         </w:r>
       </w:del>
-      <w:ins w:id="9039" w:author="huy.dt" w:date="2026-10-27T08:00:00Z">
+      <w:ins w:id="9043" w:author="huy.dt" w:date="2026-10-27T08:00:00Z">
         <w:r>
           <w:rPr>
             <w:lang w:val="pt-BR"/>
@@ -3299,7 +3329,7 @@
         </w:rPr>
         <w:t xml:space="preserve">Tính đến </w:t>
       </w:r>
-      <w:del w:id="9040" w:author="huy.dt" w:date="2026-10-27T08:00:00Z">
+      <w:del w:id="9044" w:author="huy.dt" w:date="2026-10-27T08:00:00Z">
         <w:r>
           <w:rPr>
             <w:rFonts w:ascii="Times New Roman" w:hAnsi="Times New Roman"/>
@@ -3310,7 +3340,7 @@
           <w:delText xml:space="preserve">Ngày chuyển giao</w:delText>
         </w:r>
       </w:del>
-      <w:ins w:id="9041" w:author="huy.dt" w:date="2026-10-27T08:00:00Z">
+      <w:ins w:id="9045" w:author="huy.dt" w:date="2026-10-27T08:00:00Z">
         <w:r>
           <w:rPr>
             <w:rFonts w:ascii="Times New Roman" w:hAnsi="Times New Roman"/>
@@ -3344,7 +3374,7 @@
         <w:contextualSpacing w:val="0"/>
         <w:jc w:val="both"/>
         <w:rPr>
-          <w:del w:id="9051" w:author="huy.dt" w:date="2026-10-27T08:00:00Z"/>
+          <w:del w:id="9055" w:author="huy.dt" w:date="2026-10-27T08:00:00Z"/>
           <w:rFonts w:ascii="Times New Roman" w:hAnsi="Times New Roman"/>
           <w:strike/>
           <w:color w:val="EE0000"/>
@@ -3354,7 +3384,7 @@
         </w:rPr>
       </w:pPr>
       <w:commentRangeStart w:id="107"/>
-      <w:del w:id="9042" w:author="huy.dt" w:date="2026-10-27T08:00:00Z">
+      <w:del w:id="9046" w:author="huy.dt" w:date="2026-10-27T08:00:00Z">
         <w:r>
           <w:rPr>
             <w:rFonts w:ascii="Times New Roman" w:hAnsi="Times New Roman"/>
@@ -3366,7 +3396,7 @@
           <w:delText xml:space="preserve">Khối lượng LNG đã giao nhận giữa Bên A và Bên B theo cam kết tại công văn số 3299/KDK-KD ngày 09/7/2026 và công văn số 4031/KDK-KD ngày 18/8/2026 là: ⁠</w:delText>
         </w:r>
       </w:del>
-      <w:del w:id="9043" w:author="huy.dt" w:date="2026-10-27T08:00:00Z">
+      <w:del w:id="9047" w:author="huy.dt" w:date="2026-10-27T08:00:00Z">
         <w:r>
           <w:rPr>
             <w:rFonts w:ascii="Times New Roman" w:hAnsi="Times New Roman"/>
@@ -3379,7 +3409,7 @@
           <w:delText xml:space="preserve">1.559,34 MT</w:delText>
         </w:r>
       </w:del>
-      <w:del w:id="9044" w:author="huy.dt" w:date="2026-10-27T08:00:00Z">
+      <w:del w:id="9048" w:author="huy.dt" w:date="2026-10-27T08:00:00Z">
         <w:r>
           <w:rPr>
             <w:rFonts w:ascii="Times New Roman" w:hAnsi="Times New Roman"/>
@@ -3392,7 +3422,7 @@
         </w:r>
       </w:del>
       <w:commentRangeStart w:id="3"/>
-      <w:del w:id="9045" w:author="huy.dt" w:date="2026-10-27T08:00:00Z">
+      <w:del w:id="9049" w:author="huy.dt" w:date="2026-10-27T08:00:00Z">
         <w:r>
           <w:rPr>
             <w:rFonts w:ascii="Times New Roman" w:hAnsi="Times New Roman"/>
@@ -3404,7 +3434,7 @@
           <w:delText xml:space="preserve">khối lượng LNG còn lại là: ⁠</w:delText>
         </w:r>
       </w:del>
-      <w:del w:id="9046" w:author="huy.dt" w:date="2026-10-27T08:00:00Z">
+      <w:del w:id="9050" w:author="huy.dt" w:date="2026-10-27T08:00:00Z">
         <w:r>
           <w:rPr>
             <w:rFonts w:ascii="Times New Roman" w:hAnsi="Times New Roman"/>
@@ -3427,7 +3457,7 @@
         </w:rPr>
         <w:commentReference w:id="3"/>
       </w:r>
-      <w:del w:id="9047" w:author="huy.dt" w:date="2026-10-27T08:00:00Z">
+      <w:del w:id="9051" w:author="huy.dt" w:date="2026-10-27T08:00:00Z">
         <w:r>
           <w:rPr>
             <w:rFonts w:ascii="Times New Roman" w:hAnsi="Times New Roman"/>
@@ -3439,7 +3469,7 @@
           <w:delText>.</w:delText>
         </w:r>
       </w:del>
-      <w:del w:id="9048" w:author="huy.dt" w:date="2026-10-27T08:00:00Z">
+      <w:del w:id="9052" w:author="huy.dt" w:date="2026-10-27T08:00:00Z">
         <w:r>
           <w:rPr>
             <w:strike/>
@@ -3448,7 +3478,7 @@
           <w:delText xml:space="preserve"> </w:delText>
         </w:r>
       </w:del>
-      <w:del w:id="9049" w:author="huy.dt" w:date="2026-10-27T08:00:00Z">
+      <w:del w:id="9053" w:author="huy.dt" w:date="2026-10-27T08:00:00Z">
         <w:r>
           <w:rPr>
             <w:rFonts w:ascii="Times New Roman" w:hAnsi="Times New Roman"/>
@@ -3461,7 +3491,7 @@
           <w:delText xml:space="preserve">Thời hạn giao nhận khối lượng LNG còn lại là </w:delText>
         </w:r>
       </w:del>
-      <w:del w:id="9050" w:author="huy.dt" w:date="2026-10-27T08:00:00Z">
+      <w:del w:id="9054" w:author="huy.dt" w:date="2026-10-27T08:00:00Z">
         <w:r>
           <w:rPr>
             <w:rFonts w:ascii="Times New Roman" w:hAnsi="Times New Roman"/>
@@ -3495,7 +3525,7 @@
         <w:contextualSpacing w:val="0"/>
         <w:jc w:val="both"/>
         <w:rPr>
-          <w:del w:id="9055" w:author="huy.dt" w:date="2026-10-27T08:00:00Z"/>
+          <w:del w:id="9059" w:author="huy.dt" w:date="2026-10-27T08:00:00Z"/>
           <w:rFonts w:ascii="Times New Roman" w:hAnsi="Times New Roman"/>
           <w:strike/>
           <w:color w:val="EE0000"/>
@@ -3504,7 +3534,7 @@
           <w:lang w:val="pt-BR"/>
         </w:rPr>
       </w:pPr>
-      <w:del w:id="9052" w:author="huy.dt" w:date="2026-10-27T08:00:00Z">
+      <w:del w:id="9056" w:author="huy.dt" w:date="2026-10-27T08:00:00Z">
         <w:r>
           <w:rPr>
             <w:rFonts w:ascii="Times New Roman" w:hAnsi="Times New Roman"/>
@@ -3516,7 +3546,7 @@
           <w:delText xml:space="preserve">Giá bán cho khối lượng LNG còn lại là </w:delText>
         </w:r>
       </w:del>
-      <w:del w:id="9053" w:author="huy.dt" w:date="2026-10-27T08:00:00Z">
+      <w:del w:id="9057" w:author="huy.dt" w:date="2026-10-27T08:00:00Z">
         <w:r>
           <w:rPr>
             <w:rFonts w:ascii="Times New Roman" w:hAnsi="Times New Roman"/>
@@ -3529,7 +3559,7 @@
           <w:delText>19,….</w:delText>
         </w:r>
       </w:del>
-      <w:del w:id="9054" w:author="huy.dt" w:date="2026-10-27T08:00:00Z">
+      <w:del w:id="9058" w:author="huy.dt" w:date="2026-10-27T08:00:00Z">
         <w:r>
           <w:rPr>
             <w:rFonts w:ascii="Times New Roman" w:hAnsi="Times New Roman"/>
@@ -3564,7 +3594,7 @@
         </w:rPr>
       </w:pPr>
       <w:commentRangeStart w:id="108"/>
-      <w:del w:id="9056" w:author="huy.dt" w:date="2026-10-27T08:00:00Z">
+      <w:del w:id="9060" w:author="huy.dt" w:date="2026-10-27T08:00:00Z">
         <w:r>
           <w:rPr>
             <w:rFonts w:ascii="Times New Roman" w:hAnsi="Times New Roman"/>
@@ -3576,7 +3606,7 @@
           <w:delText xml:space="preserve">PVGas Trading sẽ thông báo bằng văn bản khối lượng cam kết, khối lượng hàng còn lại sau cam kết và giá bán sau 24h ngày 31/10/2026.</w:delText>
         </w:r>
       </w:del>
-      <w:ins w:id="9057" w:author="huy.dt" w:date="2026-10-27T08:00:00Z">
+      <w:ins w:id="9061" w:author="huy.dt" w:date="2026-10-27T08:00:00Z">
         <w:r>
           <w:rPr>
             <w:rFonts w:ascii="Times New Roman" w:hAnsi="Times New Roman"/>
@@ -3609,7 +3639,7 @@
         <w:contextualSpacing w:val="0"/>
         <w:jc w:val="both"/>
         <w:rPr>
-          <w:ins w:id="9058" w:author="huy.dt" w:date="2026-10-27T08:00:00Z"/>
+          <w:ins w:id="9062" w:author="huy.dt" w:date="2026-10-27T08:00:00Z"/>
           <w:rFonts w:ascii="Times New Roman" w:hAnsi="Times New Roman"/>
           <w:color w:val="FF0000"/>
           <w:sz w:val="26"/>
@@ -3617,7 +3647,7 @@
           <w:lang w:val="pt-BR"/>
         </w:rPr>
       </w:pPr>
-      <w:ins w:id="9059" w:author="huy.dt" w:date="2026-10-27T08:00:00Z">
+      <w:ins w:id="9063" w:author="huy.dt" w:date="2026-10-27T08:00:00Z">
         <w:r>
           <w:rPr>
             <w:rFonts w:ascii="Times New Roman" w:hAnsi="Times New Roman"/>
@@ -3655,7 +3685,7 @@
         </w:rPr>
         <w:t xml:space="preserve">Đối với </w:t>
       </w:r>
-      <w:del w:id="9060" w:author="huy.dt" w:date="2026-10-27T08:00:00Z">
+      <w:del w:id="9064" w:author="huy.dt" w:date="2026-10-27T08:00:00Z">
         <w:r>
           <w:rPr>
             <w:lang w:val="pt-BR"/>
@@ -3663,7 +3693,7 @@
           <w:delText xml:space="preserve">khối lượng HÀNG đã được </w:delText>
         </w:r>
       </w:del>
-      <w:ins w:id="9061" w:author="huy.dt" w:date="2026-10-27T08:00:00Z">
+      <w:ins w:id="9065" w:author="huy.dt" w:date="2026-10-27T08:00:00Z">
         <w:r>
           <w:rPr>
             <w:lang w:val="pt-BR"/>
@@ -3671,7 +3701,7 @@
           <w:t xml:space="preserve">các Chuyến HÀNG trước chuyển giao</w:t>
         </w:r>
       </w:ins>
-      <w:del w:id="9062" w:author="huy.dt" w:date="2026-10-27T08:00:00Z">
+      <w:del w:id="9066" w:author="huy.dt" w:date="2026-10-27T08:00:00Z">
         <w:r>
           <w:rPr>
             <w:rFonts w:ascii="Times New Roman" w:hAnsi="Times New Roman"/>
@@ -3682,7 +3712,7 @@
           <w:delText xml:space="preserve">Bên A</w:delText>
         </w:r>
       </w:del>
-      <w:del w:id="9063" w:author="huy.dt" w:date="2026-10-27T08:00:00Z">
+      <w:del w:id="9067" w:author="huy.dt" w:date="2026-10-27T08:00:00Z">
         <w:r>
           <w:rPr>
             <w:lang w:val="pt-BR"/>
@@ -3690,7 +3720,7 @@
           <w:delText xml:space="preserve"> giao trước 24 giờ 00 phút ngày 31/10/2026, </w:delText>
         </w:r>
       </w:del>
-      <w:ins w:id="9064" w:author="huy.dt" w:date="2026-10-27T08:00:00Z">
+      <w:ins w:id="9068" w:author="huy.dt" w:date="2026-10-27T08:00:00Z">
         <w:r>
           <w:rPr>
             <w:lang w:val="pt-BR"/>
@@ -3704,7 +3734,7 @@
         </w:rPr>
         <w:t xml:space="preserve">Bên B có trách nhiệm thanh toán đầy đủ cho Bên A theo đúng thời hạn và các điều kiện thanh toán quy định tại Hợp đồng. </w:t>
       </w:r>
-      <w:ins w:id="9065" w:author="huy.dt" w:date="2026-10-27T08:00:00Z">
+      <w:ins w:id="9069" w:author="huy.dt" w:date="2026-10-27T08:00:00Z">
         <w:r>
           <w:rPr>
             <w:lang w:val="pt-BR"/>
@@ -3723,11 +3753,11 @@
     <w:p>
       <w:pPr>
         <w:rPr>
-          <w:del w:id="9068" w:author="huy.dt" w:date="2026-10-27T08:00:00Z"/>
+          <w:del w:id="9072" w:author="huy.dt" w:date="2026-10-27T08:00:00Z"/>
           <w:lang w:val="pt-BR"/>
         </w:rPr>
       </w:pPr>
-      <w:del w:id="9066" w:author="huy.dt" w:date="2026-10-27T08:00:00Z">
+      <w:del w:id="9070" w:author="huy.dt" w:date="2026-10-27T08:00:00Z">
         <w:r>
           <w:rPr>
             <w:lang w:val="pt-BR"/>
@@ -3735,7 +3765,7 @@
           <w:delText>(</w:delText>
         </w:r>
       </w:del>
-      <w:del w:id="9067" w:author="huy.dt" w:date="2026-10-27T08:00:00Z">
+      <w:del w:id="9071" w:author="huy.dt" w:date="2026-10-27T08:00:00Z">
         <w:r>
           <w:rPr>
             <w:i/>
@@ -3768,7 +3798,7 @@
           <w:lang w:val="pt-BR"/>
         </w:rPr>
       </w:pPr>
-      <w:del w:id="9069" w:author="huy.dt" w:date="2026-10-27T08:00:00Z">
+      <w:del w:id="9073" w:author="huy.dt" w:date="2026-10-27T08:00:00Z">
         <w:r>
           <w:rPr>
             <w:rFonts w:ascii="Times New Roman" w:hAnsi="Times New Roman"/>
@@ -3778,7 +3808,7 @@
           <w:delText xml:space="preserve">Kể từ Ngày chuyển giao : </w:delText>
         </w:r>
       </w:del>
-      <w:ins w:id="9070" w:author="huy.dt" w:date="2026-10-27T08:00:00Z">
+      <w:ins w:id="9074" w:author="huy.dt" w:date="2026-10-27T08:00:00Z">
         <w:r>
           <w:rPr>
             <w:rFonts w:ascii="Times New Roman" w:hAnsi="Times New Roman"/>
@@ -3809,7 +3839,7 @@
         </w:rPr>
       </w:pPr>
       <w:commentRangeStart w:id="110"/>
-      <w:del w:id="9071" w:author="huy.dt" w:date="2026-10-27T08:00:00Z">
+      <w:del w:id="9075" w:author="huy.dt" w:date="2026-10-27T08:00:00Z">
         <w:r>
           <w:rPr>
             <w:rFonts w:ascii="Times New Roman" w:hAnsi="Times New Roman"/>
@@ -3820,7 +3850,7 @@
           <w:delText xml:space="preserve">Toàn bộ khối lượng khí </w:delText>
         </w:r>
       </w:del>
-      <w:ins w:id="9072" w:author="huy.dt" w:date="2026-10-27T08:00:00Z">
+      <w:ins w:id="9076" w:author="huy.dt" w:date="2026-10-27T08:00:00Z">
         <w:r>
           <w:rPr>
             <w:rFonts w:ascii="Times New Roman" w:hAnsi="Times New Roman"/>
@@ -3850,7 +3880,7 @@
         </w:rPr>
         <w:t xml:space="preserve">sẽ được Bên C cung cấp cho Bên B. Bên C có trách nhiệm thực hiện việc đối soát </w:t>
       </w:r>
-      <w:del w:id="9073" w:author="huy.dt" w:date="2026-10-27T08:00:00Z">
+      <w:del w:id="9077" w:author="huy.dt" w:date="2026-10-27T08:00:00Z">
         <w:r>
           <w:rPr>
             <w:rFonts w:ascii="Times New Roman" w:hAnsi="Times New Roman"/>
@@ -3861,7 +3891,7 @@
           <w:delText xml:space="preserve">khối lượng khí,</w:delText>
         </w:r>
       </w:del>
-      <w:ins w:id="9074" w:author="huy.dt" w:date="2026-10-27T08:00:00Z">
+      <w:ins w:id="9078" w:author="huy.dt" w:date="2026-10-27T08:00:00Z">
         <w:r>
           <w:rPr>
             <w:rFonts w:ascii="Times New Roman" w:hAnsi="Times New Roman"/>
@@ -3902,14 +3932,14 @@
         <w:contextualSpacing w:val="0"/>
         <w:jc w:val="both"/>
         <w:rPr>
-          <w:ins w:id="9075" w:author="huy.dt" w:date="2026-10-27T08:00:00Z"/>
+          <w:ins w:id="9079" w:author="huy.dt" w:date="2026-10-27T08:00:00Z"/>
           <w:rFonts w:ascii="Times New Roman" w:hAnsi="Times New Roman"/>
           <w:sz w:val="26"/>
           <w:szCs w:val="26"/>
           <w:lang w:val="pt-BR"/>
         </w:rPr>
       </w:pPr>
-      <w:ins w:id="9076" w:author="huy.dt" w:date="2026-10-27T08:00:00Z">
+      <w:ins w:id="9080" w:author="huy.dt" w:date="2026-10-27T08:00:00Z">
         <w:r>
           <w:rPr>
             <w:rFonts w:ascii="Times New Roman" w:hAnsi="Times New Roman"/>
@@ -3934,14 +3964,14 @@
         <w:contextualSpacing w:val="0"/>
         <w:jc w:val="both"/>
         <w:rPr>
-          <w:ins w:id="9077" w:author="huy.dt" w:date="2026-10-27T08:00:00Z"/>
+          <w:ins w:id="9081" w:author="huy.dt" w:date="2026-10-27T08:00:00Z"/>
           <w:rFonts w:ascii="Times New Roman" w:hAnsi="Times New Roman"/>
           <w:sz w:val="26"/>
           <w:szCs w:val="26"/>
           <w:lang w:val="pt-BR"/>
         </w:rPr>
       </w:pPr>
-      <w:ins w:id="9078" w:author="huy.dt" w:date="2026-10-27T08:00:00Z">
+      <w:ins w:id="9082" w:author="huy.dt" w:date="2026-10-27T08:00:00Z">
         <w:r>
           <w:rPr>
             <w:rFonts w:ascii="Times New Roman" w:hAnsi="Times New Roman"/>
@@ -3966,14 +3996,14 @@
         <w:contextualSpacing w:val="0"/>
         <w:jc w:val="both"/>
         <w:rPr>
-          <w:ins w:id="9079" w:author="huy.dt" w:date="2026-10-27T08:00:00Z"/>
+          <w:ins w:id="9083" w:author="huy.dt" w:date="2026-10-27T08:00:00Z"/>
           <w:rFonts w:ascii="Times New Roman" w:hAnsi="Times New Roman"/>
           <w:sz w:val="26"/>
           <w:szCs w:val="26"/>
           <w:lang w:val="pt-BR"/>
         </w:rPr>
       </w:pPr>
-      <w:ins w:id="9080" w:author="huy.dt" w:date="2026-10-27T08:00:00Z">
+      <w:ins w:id="9084" w:author="huy.dt" w:date="2026-10-27T08:00:00Z">
         <w:r>
           <w:rPr>
             <w:rFonts w:ascii="Times New Roman" w:hAnsi="Times New Roman"/>
@@ -4074,7 +4104,7 @@
         </w:rPr>
         <w:t xml:space="preserve">Chủ tài khoản: Chi nhánh Kinh doanh LNG -  Tổng công ty Khí Việt Nam - CTCP.</w:t>
       </w:r>
-      <w:ins w:id="9081" w:author="huy.dt" w:date="2026-10-27T08:00:00Z">
+      <w:ins w:id="9085" w:author="huy.dt" w:date="2026-10-27T08:00:00Z">
         <w:r>
           <w:rPr>
             <w:rFonts w:ascii="Times New Roman" w:hAnsi="Times New Roman"/>
@@ -4104,7 +4134,7 @@
         </w:rPr>
       </w:pPr>
       <w:commentRangeStart w:id="111"/>
-      <w:del w:id="9082" w:author="huy.dt" w:date="2026-10-27T08:00:00Z">
+      <w:del w:id="9086" w:author="huy.dt" w:date="2026-10-27T08:00:00Z">
         <w:r>
           <w:rPr>
             <w:rFonts w:ascii="Times New Roman" w:hAnsi="Times New Roman"/>
@@ -4114,7 +4144,7 @@
           <w:delText xml:space="preserve">Thời hạn tiêu thụ khối lượng LNG còn lại là 31/12/2026.</w:delText>
         </w:r>
       </w:del>
-      <w:ins w:id="9083" w:author="huy.dt" w:date="2026-10-27T08:00:00Z">
+      <w:ins w:id="9087" w:author="huy.dt" w:date="2026-10-27T08:00:00Z">
         <w:r>
           <w:rPr>
             <w:rFonts w:ascii="Times New Roman" w:hAnsi="Times New Roman"/>
@@ -4177,7 +4207,7 @@
         </w:rPr>
         <w:t xml:space="preserve">Bên A cam kết sẽ bàn giao đầy đủ cho Bên C toàn bộ hồ sơ, chứng từ, </w:t>
       </w:r>
-      <w:del w:id="9084" w:author="huy.dt" w:date="2026-10-27T08:00:00Z">
+      <w:del w:id="9088" w:author="huy.dt" w:date="2026-10-27T08:00:00Z">
         <w:r>
           <w:rPr>
             <w:rFonts w:ascii="Times New Roman" w:hAnsi="Times New Roman"/>
@@ -4187,7 +4217,7 @@
           <w:delText xml:space="preserve">bản gốc Hợp đồng, các phụ lục kèm theo.</w:delText>
         </w:r>
       </w:del>
-      <w:ins w:id="9085" w:author="huy.dt" w:date="2026-10-27T08:00:00Z">
+      <w:ins w:id="9089" w:author="huy.dt" w:date="2026-10-27T08:00:00Z">
         <w:r>
           <w:rPr>
             <w:rFonts w:ascii="Times New Roman" w:hAnsi="Times New Roman"/>
@@ -4205,7 +4235,7 @@
         </w:rPr>
         <w:t xml:space="preserve"> Việc hoàn tất bàn giao sẽ được ghi nhận bằng biên bản bàn giao hồ sơ.</w:t>
       </w:r>
-      <w:ins w:id="9086" w:author="huy.dt" w:date="2026-10-27T08:00:00Z">
+      <w:ins w:id="9090" w:author="huy.dt" w:date="2026-10-27T08:00:00Z">
         <w:r>
           <w:rPr>
             <w:rFonts w:ascii="Times New Roman" w:hAnsi="Times New Roman"/>
@@ -4244,7 +4274,7 @@
         </w:rPr>
         <w:t xml:space="preserve">Bên A và Bên B cam kết hoàn thành toàn bộ nghĩa vụ công nợ phát sinh </w:t>
       </w:r>
-      <w:del w:id="9087" w:author="huy.dt" w:date="2026-10-27T08:00:00Z">
+      <w:del w:id="9091" w:author="huy.dt" w:date="2026-10-27T08:00:00Z">
         <w:r>
           <w:rPr>
             <w:rFonts w:ascii="Times New Roman" w:hAnsi="Times New Roman"/>
@@ -4254,7 +4284,7 @@
           <w:delText xml:space="preserve">với với</w:delText>
         </w:r>
       </w:del>
-      <w:ins w:id="9088" w:author="huy.dt" w:date="2026-10-27T08:00:00Z">
+      <w:ins w:id="9092" w:author="huy.dt" w:date="2026-10-27T08:00:00Z">
         <w:r>
           <w:rPr>
             <w:rFonts w:ascii="Times New Roman" w:hAnsi="Times New Roman"/>
@@ -4272,7 +4302,7 @@
         </w:rPr>
         <w:t xml:space="preserve"> bên còn lại theo đúng quy định tại Hợp đồng. </w:t>
       </w:r>
-      <w:ins w:id="9089" w:author="huy.dt" w:date="2026-10-27T08:00:00Z">
+      <w:ins w:id="9093" w:author="huy.dt" w:date="2026-10-27T08:00:00Z">
         <w:r>
           <w:rPr>
             <w:rFonts w:ascii="Times New Roman" w:hAnsi="Times New Roman"/>
@@ -4310,7 +4340,7 @@
         </w:rPr>
         <w:t xml:space="preserve">Bên C có trách nhiệm tiếp nhận toàn bộ quyền và nghĩa vụ của Bên A theo Hợp đồng kể từ Ngày chuyển giao. </w:t>
       </w:r>
-      <w:del w:id="9090" w:author="huy.dt" w:date="2026-10-27T08:00:00Z">
+      <w:del w:id="9094" w:author="huy.dt" w:date="2026-10-27T08:00:00Z">
         <w:r>
           <w:rPr>
             <w:rFonts w:ascii="Times New Roman" w:hAnsi="Times New Roman"/>
@@ -4320,7 +4350,7 @@
           <w:delText xml:space="preserve">Tuy nhiên, Bên A có nghĩa vụ bồi hoàn và giữ cho Bên C được miễn trừ khỏi mọi trách nhiệm pháp lý, khoản phạt, bồi thường thiệt hại, tranh chấp, khiếu nại, khiếu kiện hoặc nghĩa vụ khác liên quan đến quá trình thực hiện Hợp đồng giữa Bên A và Bên B trước thời điểm chuyển giao hợp đồng. </w:delText>
         </w:r>
       </w:del>
-      <w:ins w:id="9091" w:author="huy.dt" w:date="2026-10-27T08:00:00Z">
+      <w:ins w:id="9095" w:author="huy.dt" w:date="2026-10-27T08:00:00Z">
         <w:r>
           <w:rPr>
             <w:rFonts w:ascii="Times New Roman" w:hAnsi="Times New Roman"/>
@@ -4351,13 +4381,13 @@
         <w:contextualSpacing w:val="0"/>
         <w:jc w:val="both"/>
         <w:rPr>
-          <w:ins w:id="9092" w:author="huy.dt" w:date="2026-10-27T08:00:00Z"/>
+          <w:ins w:id="9096" w:author="huy.dt" w:date="2026-10-27T08:00:00Z"/>
           <w:rFonts w:ascii="Times New Roman" w:hAnsi="Times New Roman"/>
           <w:sz w:val="26"/>
           <w:szCs w:val="26"/>
         </w:rPr>
       </w:pPr>
-      <w:ins w:id="9093" w:author="huy.dt" w:date="2026-10-27T08:00:00Z">
+      <w:ins w:id="9097" w:author="huy.dt" w:date="2026-10-27T08:00:00Z">
         <w:r>
           <w:rPr>
             <w:rFonts w:ascii="Times New Roman" w:hAnsi="Times New Roman"/>
@@ -4381,13 +4411,13 @@
         <w:contextualSpacing w:val="0"/>
         <w:jc w:val="both"/>
         <w:rPr>
-          <w:ins w:id="9094" w:author="huy.dt" w:date="2026-10-27T08:00:00Z"/>
+          <w:ins w:id="9098" w:author="huy.dt" w:date="2026-10-27T08:00:00Z"/>
           <w:rFonts w:ascii="Times New Roman" w:hAnsi="Times New Roman"/>
           <w:sz w:val="26"/>
           <w:szCs w:val="26"/>
         </w:rPr>
       </w:pPr>
-      <w:ins w:id="9095" w:author="huy.dt" w:date="2026-10-27T08:00:00Z">
+      <w:ins w:id="9099" w:author="huy.dt" w:date="2026-10-27T08:00:00Z">
         <w:r>
           <w:rPr>
             <w:rFonts w:ascii="Times New Roman" w:hAnsi="Times New Roman"/>
@@ -4531,7 +4561,7 @@
         </w:rPr>
         <w:t xml:space="preserve">Thỏa thuận này ràng buộc quyền và trách nhiệm của các Bên và </w:t>
       </w:r>
-      <w:del w:id="9096" w:author="huy.dt" w:date="2026-10-27T08:00:00Z">
+      <w:del w:id="9100" w:author="huy.dt" w:date="2026-10-27T08:00:00Z">
         <w:r>
           <w:rPr>
             <w:rFonts w:ascii="Times New Roman" w:hAnsi="Times New Roman"/>
@@ -4541,14 +4571,14 @@
           <w:delText xml:space="preserve">có hiệu lực kể từ 00 giờ ngày    tháng    năm 2026.</w:delText>
         </w:r>
       </w:del>
-      <w:ins w:id="9097" w:author="huy.dt" w:date="2026-10-27T08:00:00Z">
+      <w:ins w:id="9101" w:author="huy.dt" w:date="2026-10-27T08:00:00Z">
         <w:r>
           <w:rPr>
             <w:rFonts w:ascii="Times New Roman" w:hAnsi="Times New Roman"/>
             <w:sz w:val="26"/>
             <w:szCs w:val="26"/>
           </w:rPr>
-          <w:t xml:space="preserve">có hiệu lực kể từ ngày ký. Việc chuyển giao quyền và nghĩa vụ của Bên Bán từ Bên A sang Bên C được áp dụng kể từ Ngày chuyển giao.</w:t>
+          <w:t xml:space="preserve">có hiệu lực kể từ ngày ký. Việc chuyển giao quyền và nghĩa vụ của Bên Bán từ Bên A sang Bên C được áp dụng kể từ Ngày chuyển giao (00 giờ 00 phút ngày 01/11/2026).</w:t>
         </w:r>
       </w:ins>
       <w:commentRangeEnd w:id="114"/>
@@ -4575,7 +4605,7 @@
         </w:rPr>
         <w:t xml:space="preserve">Thỏa thuận gồm </w:t>
       </w:r>
-      <w:del w:id="9098" w:author="huy.dt" w:date="2026-10-27T08:00:00Z">
+      <w:del w:id="9102" w:author="huy.dt" w:date="2026-10-27T08:00:00Z">
         <w:r>
           <w:rPr>
             <w:lang w:val="pt-BR"/>
@@ -4583,7 +4613,7 @@
           <w:delText xml:space="preserve">04 (bốn) trang chính</w:delText>
         </w:r>
       </w:del>
-      <w:ins w:id="9099" w:author="huy.dt" w:date="2026-10-27T08:00:00Z">
+      <w:ins w:id="9103" w:author="huy.dt" w:date="2026-10-27T08:00:00Z">
         <w:r>
           <w:rPr>
             <w:lang w:val="pt-BR"/>
@@ -4878,7 +4908,7 @@
       </w:r>
     </w:p>
   </w:comment>
-  <w:comment w:id="101" w:author="huy.dt" w:date="2026-10-27T07:54:19Z" w:initials="HD">
+  <w:comment w:id="101" w:author="huy.dt" w:date="2026-10-27T08:22:08Z" w:initials="HD">
     <w:p>
       <w:r>
         <w:rPr>
@@ -4896,7 +4926,7 @@
       </w:r>
     </w:p>
   </w:comment>
-  <w:comment w:id="102" w:author="huy.dt" w:date="2026-10-27T07:54:19Z" w:initials="HD">
+  <w:comment w:id="102" w:author="huy.dt" w:date="2026-10-27T08:22:08Z" w:initials="HD">
     <w:p>
       <w:r>
         <w:rPr>
@@ -4914,7 +4944,7 @@
       </w:r>
     </w:p>
   </w:comment>
-  <w:comment w:id="103" w:author="huy.dt" w:date="2026-10-27T07:54:19Z" w:initials="HD">
+  <w:comment w:id="103" w:author="huy.dt" w:date="2026-10-27T08:22:08Z" w:initials="HD">
     <w:p>
       <w:r>
         <w:rPr>
@@ -4932,7 +4962,7 @@
       </w:r>
     </w:p>
   </w:comment>
-  <w:comment w:id="104" w:author="huy.dt" w:date="2026-10-27T07:54:19Z" w:initials="HD">
+  <w:comment w:id="104" w:author="huy.dt" w:date="2026-10-27T08:22:08Z" w:initials="HD">
     <w:p>
       <w:r>
         <w:rPr>
@@ -4950,7 +4980,7 @@
       </w:r>
     </w:p>
   </w:comment>
-  <w:comment w:id="105" w:author="huy.dt" w:date="2026-10-27T07:54:19Z" w:initials="HD">
+  <w:comment w:id="105" w:author="huy.dt" w:date="2026-10-27T08:22:08Z" w:initials="HD">
     <w:p>
       <w:r>
         <w:rPr>
@@ -4964,11 +4994,11 @@
           <w:sz w:val="20"/>
           <w:szCs w:val="20"/>
         </w:rPr>
-        <w:t xml:space="preserve">Ngày chuyển giao để trống là rủi ro lớn nhất của dự thảo, vì mọi quyền, nghĩa vụ đều neo vào mốc này. Đề nghị ghi cố định 00h00 ngày 01/11/2026, thống nhất với CV 5047/KDK-KD và Biên bản họp ngày 26/10/2026. Bổ sung định nghĩa “Thời điểm chốt số liệu”, “Chuyến HÀNG trước chuyển giao” và “Nghĩa vụ trước chuyển giao” để phân định trách nhiệm.</w:t>
+        <w:t xml:space="preserve">Ngày chuyển giao để trống là rủi ro lớn nhất của dự thảo, vì mọi quyền, nghĩa vụ đều neo vào mốc này. Đề nghị ghi cố định 00h00 ngày 01/11/2026, thống nhất với CV 5047/KDK-KD và Biên bản họp ngày 26/10/2026; mốc này cũng được ghi trực tiếp tại phần mở đầu, Mục II.1 và Mục III. Bổ sung định nghĩa “Thời điểm chốt số liệu”, “Chuyến HÀNG trước chuyển giao” và “Nghĩa vụ trước chuyển giao” để phân định trách nhiệm.</w:t>
       </w:r>
     </w:p>
   </w:comment>
-  <w:comment w:id="106" w:author="huy.dt" w:date="2026-10-27T07:54:19Z" w:initials="HD">
+  <w:comment w:id="106" w:author="huy.dt" w:date="2026-10-27T08:22:08Z" w:initials="HD">
     <w:p>
       <w:r>
         <w:rPr>
@@ -4986,7 +5016,7 @@
       </w:r>
     </w:p>
   </w:comment>
-  <w:comment w:id="107" w:author="huy.dt" w:date="2026-10-27T07:54:19Z" w:initials="HD">
+  <w:comment w:id="107" w:author="huy.dt" w:date="2026-10-27T08:22:09Z" w:initials="HD">
     <w:p>
       <w:r>
         <w:rPr>
@@ -5004,7 +5034,7 @@
       </w:r>
     </w:p>
   </w:comment>
-  <w:comment w:id="108" w:author="huy.dt" w:date="2026-10-27T07:54:19Z" w:initials="HD">
+  <w:comment w:id="108" w:author="huy.dt" w:date="2026-10-27T08:22:09Z" w:initials="HD">
     <w:p>
       <w:r>
         <w:rPr>
@@ -5022,7 +5052,7 @@
       </w:r>
     </w:p>
   </w:comment>
-  <w:comment w:id="109" w:author="huy.dt" w:date="2026-10-27T07:54:20Z" w:initials="HD">
+  <w:comment w:id="109" w:author="huy.dt" w:date="2026-10-27T08:22:09Z" w:initials="HD">
     <w:p>
       <w:r>
         <w:rPr>
@@ -5040,7 +5070,7 @@
       </w:r>
     </w:p>
   </w:comment>
-  <w:comment w:id="110" w:author="huy.dt" w:date="2026-10-27T07:54:20Z" w:initials="HD">
+  <w:comment w:id="110" w:author="huy.dt" w:date="2026-10-27T08:22:09Z" w:initials="HD">
     <w:p>
       <w:r>
         <w:rPr>
@@ -5058,7 +5088,7 @@
       </w:r>
     </w:p>
   </w:comment>
-  <w:comment w:id="111" w:author="huy.dt" w:date="2026-10-27T07:54:20Z" w:initials="HD">
+  <w:comment w:id="111" w:author="huy.dt" w:date="2026-10-27T08:22:09Z" w:initials="HD">
     <w:p>
       <w:r>
         <w:rPr>
@@ -5076,7 +5106,7 @@
       </w:r>
     </w:p>
   </w:comment>
-  <w:comment w:id="112" w:author="huy.dt" w:date="2026-10-27T07:54:20Z" w:initials="HD">
+  <w:comment w:id="112" w:author="huy.dt" w:date="2026-10-27T08:22:09Z" w:initials="HD">
     <w:p>
       <w:r>
         <w:rPr>
@@ -5094,7 +5124,7 @@
       </w:r>
     </w:p>
   </w:comment>
-  <w:comment w:id="113" w:author="huy.dt" w:date="2026-10-27T07:54:20Z" w:initials="HD">
+  <w:comment w:id="113" w:author="huy.dt" w:date="2026-10-27T08:22:09Z" w:initials="HD">
     <w:p>
       <w:r>
         <w:rPr>
@@ -5112,7 +5142,7 @@
       </w:r>
     </w:p>
   </w:comment>
-  <w:comment w:id="114" w:author="huy.dt" w:date="2026-10-27T07:54:20Z" w:initials="HD">
+  <w:comment w:id="114" w:author="huy.dt" w:date="2026-10-27T08:22:09Z" w:initials="HD">
     <w:p>
       <w:r>
         <w:rPr>
@@ -5126,11 +5156,11 @@
           <w:sz w:val="20"/>
           <w:szCs w:val="20"/>
         </w:rPr>
-        <w:t xml:space="preserve">Ghi hiệu lực “từ 00 giờ ngày …” sẽ hồi tố nếu ký sau ngày đó. Đề xuất tách “hiệu lực từ ngày ký” và “áp dụng từ Ngày chuyển giao”. Kiến nghị Ba Bên ký trước ngày 31/10/2026.</w:t>
+        <w:t xml:space="preserve">Ghi hiệu lực “từ 00 giờ ngày …” sẽ hồi tố nếu ký sau ngày đó. Đề xuất tách “hiệu lực từ ngày ký” và “áp dụng từ Ngày chuyển giao (00h00 ngày 01/11/2026)”. Kiến nghị Ba Bên ký trước ngày 31/10/2026.</w:t>
       </w:r>
     </w:p>
   </w:comment>
-  <w:comment w:id="115" w:author="huy.dt" w:date="2026-10-27T07:54:20Z" w:initials="HD">
+  <w:comment w:id="115" w:author="huy.dt" w:date="2026-10-27T08:22:09Z" w:initials="HD">
     <w:p>
       <w:r>
         <w:rPr>
@@ -5154,62 +5184,62 @@
 <file path=word/commentsExtended.xml><?xml version="1.0" encoding="utf-8"?>
 <w15:commentsEx xmlns:wpc="http://schemas.microsoft.com/office/word/2010/wordprocessingCanvas" xmlns:cx="http://schemas.microsoft.com/office/drawing/2014/chartex" xmlns:cx1="http://schemas.microsoft.com/office/drawing/2015/9/8/chartex" xmlns:cx2="http://schemas.microsoft.com/office/drawing/2015/10/21/chartex" xmlns:cx3="http://schemas.microsoft.com/office/drawing/2016/5/9/chartex" xmlns:cx4="http://schemas.microsoft.com/office/drawing/2016/5/10/chartex" xmlns:cx5="http://schemas.microsoft.com/office/drawing/2016/5/11/chartex" xmlns:cx6="http://schemas.microsoft.com/office/drawing/2016/5/12/chartex" xmlns:cx7="http://schemas.microsoft.com/office/drawing/2016/5/13/chartex" xmlns:cx8="http://schemas.microsoft.com/office/drawing/2016/5/14/chartex" xmlns:mc="http://schemas.openxmlformats.org/markup-compatibility/2006" xmlns:aink="http://schemas.microsoft.com/office/drawing/2016/ink" xmlns:am3d="http://schemas.microsoft.com/office/drawing/2017/model3d" xmlns:o="urn:schemas-microsoft-com:office:office" xmlns:r="http://schemas.openxmlformats.org/officeDocument/2006/relationships" xmlns:m="http://schemas.openxmlformats.org/officeDocument/2006/math" xmlns:v="urn:schemas-microsoft-com:vml" xmlns:wp14="http://schemas.microsoft.com/office/word/2010/wordprocessingDrawing" xmlns:wp="http://schemas.openxmlformats.org/drawingml/2006/wordprocessingDrawing" xmlns:w10="urn:schemas-microsoft-com:office:word" xmlns:w="http://schemas.openxmlformats.org/wordprocessingml/2006/main" xmlns:w14="http://schemas.microsoft.com/office/word/2010/wordml" xmlns:w15="http://schemas.microsoft.com/office/word/2012/wordml" xmlns:w16cid="http://schemas.microsoft.com/office/word/2016/wordml/cid" xmlns:w16se="http://schemas.microsoft.com/office/word/2015/wordml/symex" xmlns:wpg="http://schemas.microsoft.com/office/word/2010/wordprocessingGroup" xmlns:wpi="http://schemas.microsoft.com/office/word/2010/wordprocessingInk" xmlns:wne="http://schemas.microsoft.com/office/word/2006/wordml" xmlns:wps="http://schemas.microsoft.com/office/word/2010/wordprocessingShape" mc:Ignorable="w14 w15 w16se w16cid wp14">
   <w15:commentEx w15:paraId="09B657C8" w15:done="0"/>
-  <w15:commentEx w15:paraId="6078D2C2" w15:done="0"/>
-  <w15:commentEx w15:paraId="2BAF6B08" w15:done="0"/>
-  <w15:commentEx w15:paraId="5F5B7F49" w15:done="0"/>
-  <w15:commentEx w15:paraId="42445F0D" w15:done="0"/>
-  <w15:commentEx w15:paraId="28B7EFC0" w15:done="0"/>
-  <w15:commentEx w15:paraId="1E15D143" w15:done="0"/>
-  <w15:commentEx w15:paraId="5122B487" w15:paraIdParent="09B657C8" w15:done="0"/>
-  <w15:commentEx w15:paraId="4CE62525" w15:done="0"/>
-  <w15:commentEx w15:paraId="6D7D7CF3" w15:done="0"/>
-  <w15:commentEx w15:paraId="6910FADC" w15:done="0"/>
-  <w15:commentEx w15:paraId="76DA89F3" w15:done="0"/>
-  <w15:commentEx w15:paraId="342DD28A" w15:done="0"/>
-  <w15:commentEx w15:paraId="43382777" w15:done="0"/>
-  <w15:commentEx w15:paraId="3EAB6232" w15:done="0"/>
-  <w15:commentEx w15:paraId="7FB7312F" w15:done="0"/>
+  <w15:commentEx w15:paraId="69EFEBDC" w15:done="0"/>
+  <w15:commentEx w15:paraId="5ABCC85E" w15:done="0"/>
+  <w15:commentEx w15:paraId="5FCC5EEC" w15:done="0"/>
+  <w15:commentEx w15:paraId="6A440248" w15:done="0"/>
+  <w15:commentEx w15:paraId="0F89CF04" w15:done="0"/>
+  <w15:commentEx w15:paraId="552C5E4C" w15:done="0"/>
+  <w15:commentEx w15:paraId="096AAE7F" w15:paraIdParent="09B657C8" w15:done="0"/>
+  <w15:commentEx w15:paraId="765D4073" w15:done="0"/>
+  <w15:commentEx w15:paraId="44C3A511" w15:done="0"/>
+  <w15:commentEx w15:paraId="0BC4172E" w15:done="0"/>
+  <w15:commentEx w15:paraId="44C45D0F" w15:done="0"/>
+  <w15:commentEx w15:paraId="60653567" w15:done="0"/>
+  <w15:commentEx w15:paraId="790AAC55" w15:done="0"/>
+  <w15:commentEx w15:paraId="1F877F0A" w15:done="0"/>
+  <w15:commentEx w15:paraId="5911F5D1" w15:done="0"/>
 </w15:commentsEx>
 </file>
 
 <file path=word/commentsExtensible.xml><?xml version="1.0" encoding="utf-8"?>
 <w16cex:commentsExtensible xmlns:wpc="http://schemas.microsoft.com/office/word/2010/wordprocessingCanvas" xmlns:cx="http://schemas.microsoft.com/office/drawing/2014/chartex" xmlns:cx1="http://schemas.microsoft.com/office/drawing/2015/9/8/chartex" xmlns:cx2="http://schemas.microsoft.com/office/drawing/2015/10/21/chartex" xmlns:cx3="http://schemas.microsoft.com/office/drawing/2016/5/9/chartex" xmlns:cx4="http://schemas.microsoft.com/office/drawing/2016/5/10/chartex" xmlns:cx5="http://schemas.microsoft.com/office/drawing/2016/5/11/chartex" xmlns:cx6="http://schemas.microsoft.com/office/drawing/2016/5/12/chartex" xmlns:cx7="http://schemas.microsoft.com/office/drawing/2016/5/13/chartex" xmlns:cx8="http://schemas.microsoft.com/office/drawing/2016/5/14/chartex" xmlns:mc="http://schemas.openxmlformats.org/markup-compatibility/2006" xmlns:aink="http://schemas.microsoft.com/office/drawing/2016/ink" xmlns:am3d="http://schemas.microsoft.com/office/drawing/2017/model3d" xmlns:o="urn:schemas-microsoft-com:office:office" xmlns:oel="http://schemas.microsoft.com/office/2019/extlst" xmlns:r="http://schemas.openxmlformats.org/officeDocument/2006/relationships" xmlns:m="http://schemas.openxmlformats.org/officeDocument/2006/math" xmlns:v="urn:schemas-microsoft-com:vml" xmlns:wp14="http://schemas.microsoft.com/office/word/2010/wordprocessingDrawing" xmlns:wp="http://schemas.openxmlformats.org/drawingml/2006/wordprocessingDrawing" xmlns:w10="urn:schemas-microsoft-com:office:word" xmlns:w="http://schemas.openxmlformats.org/wordprocessingml/2006/main" xmlns:w14="http://schemas.microsoft.com/office/word/2010/wordml" xmlns:w15="http://schemas.microsoft.com/office/word/2012/wordml" xmlns:w16cex="http://schemas.microsoft.com/office/word/2018/wordml/cex" xmlns:w16cid="http://schemas.microsoft.com/office/word/2016/wordml/cid" xmlns:w16="http://schemas.microsoft.com/office/word/2018/wordml" xmlns:w16du="http://schemas.microsoft.com/office/word/2023/wordml/word16du" xmlns:w16sdtdh="http://schemas.microsoft.com/office/word/2020/wordml/sdtdatahash" xmlns:w16sdtfl="http://schemas.microsoft.com/office/word/2024/wordml/sdtformatlock" xmlns:w16se="http://schemas.microsoft.com/office/word/2015/wordml/symex" xmlns:wpg="http://schemas.microsoft.com/office/word/2010/wordprocessingGroup" xmlns:wpi="http://schemas.microsoft.com/office/word/2010/wordprocessingInk" xmlns:wne="http://schemas.microsoft.com/office/word/2006/wordml" xmlns:wps="http://schemas.microsoft.com/office/word/2010/wordprocessingShape" xmlns:cr="http://schemas.microsoft.com/office/comments/2020/reactions" mc:Ignorable="w14 w15 w16se w16cid w16 w16cex w16sdtdh w16sdtfl cr w16du wp14">
-  <w16cex:commentExtensible w16cex:durableId="6FA45795" w16cex:dateUtc="2026-10-27T07:54:19Z"/>
-  <w16cex:commentExtensible w16cex:durableId="4CB2341D" w16cex:dateUtc="2026-10-27T07:54:19Z"/>
-  <w16cex:commentExtensible w16cex:durableId="0AECF925" w16cex:dateUtc="2026-10-27T07:54:19Z"/>
-  <w16cex:commentExtensible w16cex:durableId="38798514" w16cex:dateUtc="2026-10-27T07:54:19Z"/>
-  <w16cex:commentExtensible w16cex:durableId="7B9F93BD" w16cex:dateUtc="2026-10-27T07:54:19Z"/>
-  <w16cex:commentExtensible w16cex:durableId="110F1460" w16cex:dateUtc="2026-10-27T07:54:19Z"/>
-  <w16cex:commentExtensible w16cex:durableId="6602A864" w16cex:dateUtc="2026-10-27T07:54:19Z"/>
-  <w16cex:commentExtensible w16cex:durableId="77A6115C" w16cex:dateUtc="2026-10-27T07:54:19Z"/>
-  <w16cex:commentExtensible w16cex:durableId="0B1AA1A6" w16cex:dateUtc="2026-10-27T07:54:20Z"/>
-  <w16cex:commentExtensible w16cex:durableId="2C982E15" w16cex:dateUtc="2026-10-27T07:54:20Z"/>
-  <w16cex:commentExtensible w16cex:durableId="60472BA3" w16cex:dateUtc="2026-10-27T07:54:20Z"/>
-  <w16cex:commentExtensible w16cex:durableId="771B1579" w16cex:dateUtc="2026-10-27T07:54:20Z"/>
-  <w16cex:commentExtensible w16cex:durableId="43883979" w16cex:dateUtc="2026-10-27T07:54:20Z"/>
-  <w16cex:commentExtensible w16cex:durableId="4A9827C8" w16cex:dateUtc="2026-10-27T07:54:20Z"/>
-  <w16cex:commentExtensible w16cex:durableId="692FDFD3" w16cex:dateUtc="2026-10-27T07:54:20Z"/>
+  <w16cex:commentExtensible w16cex:durableId="4A9E8085" w16cex:dateUtc="2026-10-27T08:22:08Z"/>
+  <w16cex:commentExtensible w16cex:durableId="7325A8BB" w16cex:dateUtc="2026-10-27T08:22:08Z"/>
+  <w16cex:commentExtensible w16cex:durableId="1AC78DD2" w16cex:dateUtc="2026-10-27T08:22:08Z"/>
+  <w16cex:commentExtensible w16cex:durableId="2F639F80" w16cex:dateUtc="2026-10-27T08:22:08Z"/>
+  <w16cex:commentExtensible w16cex:durableId="46F70D0B" w16cex:dateUtc="2026-10-27T08:22:08Z"/>
+  <w16cex:commentExtensible w16cex:durableId="46060A45" w16cex:dateUtc="2026-10-27T08:22:08Z"/>
+  <w16cex:commentExtensible w16cex:durableId="06CD9BB4" w16cex:dateUtc="2026-10-27T08:22:09Z"/>
+  <w16cex:commentExtensible w16cex:durableId="7678B6D1" w16cex:dateUtc="2026-10-27T08:22:09Z"/>
+  <w16cex:commentExtensible w16cex:durableId="491EDE93" w16cex:dateUtc="2026-10-27T08:22:09Z"/>
+  <w16cex:commentExtensible w16cex:durableId="2B7C0BD6" w16cex:dateUtc="2026-10-27T08:22:09Z"/>
+  <w16cex:commentExtensible w16cex:durableId="23907968" w16cex:dateUtc="2026-10-27T08:22:09Z"/>
+  <w16cex:commentExtensible w16cex:durableId="0526F11B" w16cex:dateUtc="2026-10-27T08:22:09Z"/>
+  <w16cex:commentExtensible w16cex:durableId="540EA288" w16cex:dateUtc="2026-10-27T08:22:09Z"/>
+  <w16cex:commentExtensible w16cex:durableId="32D0B7DA" w16cex:dateUtc="2026-10-27T08:22:09Z"/>
+  <w16cex:commentExtensible w16cex:durableId="77E06D93" w16cex:dateUtc="2026-10-27T08:22:09Z"/>
 </w16cex:commentsExtensible>
 </file>
 
 <file path=word/commentsIds.xml><?xml version="1.0" encoding="utf-8"?>
 <w16cid:commentsIds xmlns:wpc="http://schemas.microsoft.com/office/word/2010/wordprocessingCanvas" xmlns:cx="http://schemas.microsoft.com/office/drawing/2014/chartex" xmlns:cx1="http://schemas.microsoft.com/office/drawing/2015/9/8/chartex" xmlns:cx2="http://schemas.microsoft.com/office/drawing/2015/10/21/chartex" xmlns:cx3="http://schemas.microsoft.com/office/drawing/2016/5/9/chartex" xmlns:cx4="http://schemas.microsoft.com/office/drawing/2016/5/10/chartex" xmlns:cx5="http://schemas.microsoft.com/office/drawing/2016/5/11/chartex" xmlns:cx6="http://schemas.microsoft.com/office/drawing/2016/5/12/chartex" xmlns:cx7="http://schemas.microsoft.com/office/drawing/2016/5/13/chartex" xmlns:cx8="http://schemas.microsoft.com/office/drawing/2016/5/14/chartex" xmlns:mc="http://schemas.openxmlformats.org/markup-compatibility/2006" xmlns:aink="http://schemas.microsoft.com/office/drawing/2016/ink" xmlns:am3d="http://schemas.microsoft.com/office/drawing/2017/model3d" xmlns:o="urn:schemas-microsoft-com:office:office" xmlns:r="http://schemas.openxmlformats.org/officeDocument/2006/relationships" xmlns:m="http://schemas.openxmlformats.org/officeDocument/2006/math" xmlns:v="urn:schemas-microsoft-com:vml" xmlns:wp14="http://schemas.microsoft.com/office/word/2010/wordprocessingDrawing" xmlns:wp="http://schemas.openxmlformats.org/drawingml/2006/wordprocessingDrawing" xmlns:w10="urn:schemas-microsoft-com:office:word" xmlns:w="http://schemas.openxmlformats.org/wordprocessingml/2006/main" xmlns:w14="http://schemas.microsoft.com/office/word/2010/wordml" xmlns:w15="http://schemas.microsoft.com/office/word/2012/wordml" xmlns:w16cid="http://schemas.microsoft.com/office/word/2016/wordml/cid" xmlns:w16se="http://schemas.microsoft.com/office/word/2015/wordml/symex" xmlns:wpg="http://schemas.microsoft.com/office/word/2010/wordprocessingGroup" xmlns:wpi="http://schemas.microsoft.com/office/word/2010/wordprocessingInk" xmlns:wne="http://schemas.microsoft.com/office/word/2006/wordml" xmlns:wps="http://schemas.microsoft.com/office/word/2010/wordprocessingShape" mc:Ignorable="w14 w15 w16se w16cid wp14">
   <w16cid:commentId w16cid:paraId="09B657C8" w16cid:durableId="2E88FAEF"/>
-  <w16cid:commentId w16cid:paraId="6078D2C2" w16cid:durableId="6FA45795"/>
-  <w16cid:commentId w16cid:paraId="2BAF6B08" w16cid:durableId="4CB2341D"/>
-  <w16cid:commentId w16cid:paraId="5F5B7F49" w16cid:durableId="0AECF925"/>
-  <w16cid:commentId w16cid:paraId="42445F0D" w16cid:durableId="38798514"/>
-  <w16cid:commentId w16cid:paraId="28B7EFC0" w16cid:durableId="7B9F93BD"/>
-  <w16cid:commentId w16cid:paraId="1E15D143" w16cid:durableId="110F1460"/>
-  <w16cid:commentId w16cid:paraId="5122B487" w16cid:durableId="6602A864"/>
-  <w16cid:commentId w16cid:paraId="4CE62525" w16cid:durableId="77A6115C"/>
-  <w16cid:commentId w16cid:paraId="6D7D7CF3" w16cid:durableId="0B1AA1A6"/>
-  <w16cid:commentId w16cid:paraId="6910FADC" w16cid:durableId="2C982E15"/>
-  <w16cid:commentId w16cid:paraId="76DA89F3" w16cid:durableId="60472BA3"/>
-  <w16cid:commentId w16cid:paraId="342DD28A" w16cid:durableId="771B1579"/>
-  <w16cid:commentId w16cid:paraId="43382777" w16cid:durableId="43883979"/>
-  <w16cid:commentId w16cid:paraId="3EAB6232" w16cid:durableId="4A9827C8"/>
-  <w16cid:commentId w16cid:paraId="7FB7312F" w16cid:durableId="692FDFD3"/>
+  <w16cid:commentId w16cid:paraId="69EFEBDC" w16cid:durableId="4A9E8085"/>
+  <w16cid:commentId w16cid:paraId="5ABCC85E" w16cid:durableId="7325A8BB"/>
+  <w16cid:commentId w16cid:paraId="5FCC5EEC" w16cid:durableId="1AC78DD2"/>
+  <w16cid:commentId w16cid:paraId="6A440248" w16cid:durableId="2F639F80"/>
+  <w16cid:commentId w16cid:paraId="0F89CF04" w16cid:durableId="46F70D0B"/>
+  <w16cid:commentId w16cid:paraId="552C5E4C" w16cid:durableId="46060A45"/>
+  <w16cid:commentId w16cid:paraId="096AAE7F" w16cid:durableId="06CD9BB4"/>
+  <w16cid:commentId w16cid:paraId="765D4073" w16cid:durableId="7678B6D1"/>
+  <w16cid:commentId w16cid:paraId="44C3A511" w16cid:durableId="491EDE93"/>
+  <w16cid:commentId w16cid:paraId="0BC4172E" w16cid:durableId="2B7C0BD6"/>
+  <w16cid:commentId w16cid:paraId="44C45D0F" w16cid:durableId="23907968"/>
+  <w16cid:commentId w16cid:paraId="60653567" w16cid:durableId="0526F11B"/>
+  <w16cid:commentId w16cid:paraId="790AAC55" w16cid:durableId="540EA288"/>
+  <w16cid:commentId w16cid:paraId="1F877F0A" w16cid:durableId="32D0B7DA"/>
+  <w16cid:commentId w16cid:paraId="5911F5D1" w16cid:durableId="77E06D93"/>
 </w16cid:commentsIds>
 </file>
 

</xml_diff>